<commit_message>
Completed catalog import test script with support for both structured as well as unstructured data sources
</commit_message>
<xml_diff>
--- a/Service Graph Connector for BigID Application Design v2.2.0.docx
+++ b/Service Graph Connector for BigID Application Design v2.2.0.docx
@@ -21,6 +21,16 @@
           <w:szCs w:val="48"/>
         </w:rPr>
       </w:pPr>
+      <w:r>
+        <w:rPr>
+          <w:b/>
+          <w:smallCaps/>
+          <w:color w:val="000000"/>
+          <w:sz w:val="48"/>
+          <w:szCs w:val="48"/>
+        </w:rPr>
+        <w:t>aw</w:t>
+      </w:r>
       <w:r>
         <w:rPr>
           <w:b/>
@@ -12648,6 +12658,13 @@
               </w:rPr>
               <w:lastRenderedPageBreak/>
               <w:t>Amazon RedShift</w:t>
+            </w:r>
+            <w:r>
+              <w:rPr>
+                <w:rFonts w:eastAsia="Times New Roman"/>
+                <w:lang w:val="en-IN"/>
+              </w:rPr>
+              <w:t>db</w:t>
             </w:r>
           </w:p>
         </w:tc>
@@ -32142,6 +32159,10 @@
 </file>
 
 <file path=customXml/item1.xml><?xml version="1.0" encoding="utf-8"?>
+<b:Sources xmlns:b="http://schemas.openxmlformats.org/officeDocument/2006/bibliography" xmlns="http://schemas.openxmlformats.org/officeDocument/2006/bibliography" SelectedStyle="\APASixthEditionOfficeOnline.xsl" StyleName="APA" Version="6"/>
+</file>
+
+<file path=customXml/item2.xml><?xml version="1.0" encoding="utf-8"?>
 <p:properties xmlns:p="http://schemas.microsoft.com/office/2006/metadata/properties" xmlns:xsi="http://www.w3.org/2001/XMLSchema-instance" xmlns:pc="http://schemas.microsoft.com/office/infopath/2007/PartnerControls">
   <documentManagement>
     <lcf76f155ced4ddcb4097134ff3c332f xmlns="f6ea7ea9-81b2-4d9c-a1ab-ed9a056c4fa0">
@@ -32151,20 +32172,7 @@
 </p:properties>
 </file>
 
-<file path=customXml/item2.xml><?xml version="1.0" encoding="utf-8"?>
-<b:Sources xmlns:b="http://schemas.openxmlformats.org/officeDocument/2006/bibliography" xmlns="http://schemas.openxmlformats.org/officeDocument/2006/bibliography" SelectedStyle="\APASixthEditionOfficeOnline.xsl" StyleName="APA" Version="6"/>
-</file>
-
 <file path=customXml/item3.xml><?xml version="1.0" encoding="utf-8"?>
-<?mso-contentType ?>
-<FormTemplates xmlns="http://schemas.microsoft.com/sharepoint/v3/contenttype/forms">
-  <Display>DocumentLibraryForm</Display>
-  <Edit>DocumentLibraryForm</Edit>
-  <New>DocumentLibraryForm</New>
-</FormTemplates>
-</file>
-
-<file path=customXml/item4.xml><?xml version="1.0" encoding="utf-8"?>
 <ct:contentTypeSchema xmlns:ct="http://schemas.microsoft.com/office/2006/metadata/contentType" xmlns:ma="http://schemas.microsoft.com/office/2006/metadata/properties/metaAttributes" ct:_="" ma:_="" ma:contentTypeName="Document" ma:contentTypeID="0x0101006AB4AEB0F8404D4D9722CE80798CC795" ma:contentTypeVersion="15" ma:contentTypeDescription="Create a new document." ma:contentTypeScope="" ma:versionID="e11a8a53b54f146900b9c3a50a9d2c33">
   <xsd:schema xmlns:xsd="http://www.w3.org/2001/XMLSchema" xmlns:xs="http://www.w3.org/2001/XMLSchema" xmlns:p="http://schemas.microsoft.com/office/2006/metadata/properties" xmlns:ns2="f6ea7ea9-81b2-4d9c-a1ab-ed9a056c4fa0" xmlns:ns3="95283c23-d003-43db-900f-7fa5934590f8" targetNamespace="http://schemas.microsoft.com/office/2006/metadata/properties" ma:root="true" ma:fieldsID="34edffe4faf2b1bc65e4398f60194591" ns2:_="" ns3:_="">
     <xsd:import namespace="f6ea7ea9-81b2-4d9c-a1ab-ed9a056c4fa0"/>
@@ -32395,7 +32403,24 @@
 </ct:contentTypeSchema>
 </file>
 
+<file path=customXml/item4.xml><?xml version="1.0" encoding="utf-8"?>
+<?mso-contentType ?>
+<FormTemplates xmlns="http://schemas.microsoft.com/sharepoint/v3/contenttype/forms">
+  <Display>DocumentLibraryForm</Display>
+  <Edit>DocumentLibraryForm</Edit>
+  <New>DocumentLibraryForm</New>
+</FormTemplates>
+</file>
+
 <file path=customXml/itemProps1.xml><?xml version="1.0" encoding="utf-8"?>
+<ds:datastoreItem xmlns:ds="http://schemas.openxmlformats.org/officeDocument/2006/customXml" ds:itemID="{B6381998-5783-41AC-A862-3F976B741E2B}">
+  <ds:schemaRefs>
+    <ds:schemaRef ds:uri="http://schemas.openxmlformats.org/officeDocument/2006/bibliography"/>
+  </ds:schemaRefs>
+</ds:datastoreItem>
+</file>
+
+<file path=customXml/itemProps2.xml><?xml version="1.0" encoding="utf-8"?>
 <ds:datastoreItem xmlns:ds="http://schemas.openxmlformats.org/officeDocument/2006/customXml" ds:itemID="{B9C45EB4-DCB3-443C-8BA2-490F7CA03750}">
   <ds:schemaRefs>
     <ds:schemaRef ds:uri="http://schemas.microsoft.com/office/2006/metadata/properties"/>
@@ -32405,23 +32430,7 @@
 </ds:datastoreItem>
 </file>
 
-<file path=customXml/itemProps2.xml><?xml version="1.0" encoding="utf-8"?>
-<ds:datastoreItem xmlns:ds="http://schemas.openxmlformats.org/officeDocument/2006/customXml" ds:itemID="{B6381998-5783-41AC-A862-3F976B741E2B}">
-  <ds:schemaRefs>
-    <ds:schemaRef ds:uri="http://schemas.openxmlformats.org/officeDocument/2006/bibliography"/>
-  </ds:schemaRefs>
-</ds:datastoreItem>
-</file>
-
 <file path=customXml/itemProps3.xml><?xml version="1.0" encoding="utf-8"?>
-<ds:datastoreItem xmlns:ds="http://schemas.openxmlformats.org/officeDocument/2006/customXml" ds:itemID="{00C5860C-7760-48D1-B320-EE8C74D7C2D0}">
-  <ds:schemaRefs>
-    <ds:schemaRef ds:uri="http://schemas.microsoft.com/sharepoint/v3/contenttype/forms"/>
-  </ds:schemaRefs>
-</ds:datastoreItem>
-</file>
-
-<file path=customXml/itemProps4.xml><?xml version="1.0" encoding="utf-8"?>
 <ds:datastoreItem xmlns:ds="http://schemas.openxmlformats.org/officeDocument/2006/customXml" ds:itemID="{B5E55C6E-2537-4695-8F11-85AD1F171EEE}">
   <ds:schemaRefs>
     <ds:schemaRef ds:uri="http://schemas.microsoft.com/office/2006/metadata/contentType"/>
@@ -32438,4 +32447,12 @@
     <ds:schemaRef ds:uri="http://schemas.microsoft.com/internal/obd"/>
   </ds:schemaRefs>
 </ds:datastoreItem>
+</file>
+
+<file path=customXml/itemProps4.xml><?xml version="1.0" encoding="utf-8"?>
+<ds:datastoreItem xmlns:ds="http://schemas.openxmlformats.org/officeDocument/2006/customXml" ds:itemID="{00C5860C-7760-48D1-B320-EE8C74D7C2D0}">
+  <ds:schemaRefs>
+    <ds:schemaRef ds:uri="http://schemas.microsoft.com/sharepoint/v3/contenttype/forms"/>
+  </ds:schemaRefs>
+</ds:datastoreItem>
 </file>
</xml_diff>

<commit_message>
Export scripts for ldc and servers
</commit_message>
<xml_diff>
--- a/Service Graph Connector for BigID Application Design v2.2.0.docx
+++ b/Service Graph Connector for BigID Application Design v2.2.0.docx
@@ -9710,7 +9710,21 @@
                 <w:rFonts w:eastAsia="Times New Roman"/>
                 <w:lang w:val="en-IN"/>
               </w:rPr>
-              <w:t>cmdb_ci_ora_pdb_instance</w:t>
+              <w:t>cmdb_ci_</w:t>
+            </w:r>
+            <w:r>
+              <w:rPr>
+                <w:rFonts w:eastAsia="Times New Roman"/>
+                <w:lang w:val="en-IN"/>
+              </w:rPr>
+              <w:t>db_</w:t>
+            </w:r>
+            <w:r>
+              <w:rPr>
+                <w:rFonts w:eastAsia="Times New Roman"/>
+                <w:lang w:val="en-IN"/>
+              </w:rPr>
+              <w:t>ora_pdb_instance</w:t>
             </w:r>
           </w:p>
         </w:tc>
@@ -32159,10 +32173,6 @@
 </file>
 
 <file path=customXml/item1.xml><?xml version="1.0" encoding="utf-8"?>
-<b:Sources xmlns:b="http://schemas.openxmlformats.org/officeDocument/2006/bibliography" xmlns="http://schemas.openxmlformats.org/officeDocument/2006/bibliography" SelectedStyle="\APASixthEditionOfficeOnline.xsl" StyleName="APA" Version="6"/>
-</file>
-
-<file path=customXml/item2.xml><?xml version="1.0" encoding="utf-8"?>
 <p:properties xmlns:p="http://schemas.microsoft.com/office/2006/metadata/properties" xmlns:xsi="http://www.w3.org/2001/XMLSchema-instance" xmlns:pc="http://schemas.microsoft.com/office/infopath/2007/PartnerControls">
   <documentManagement>
     <lcf76f155ced4ddcb4097134ff3c332f xmlns="f6ea7ea9-81b2-4d9c-a1ab-ed9a056c4fa0">
@@ -32172,7 +32182,20 @@
 </p:properties>
 </file>
 
+<file path=customXml/item2.xml><?xml version="1.0" encoding="utf-8"?>
+<b:Sources xmlns:b="http://schemas.openxmlformats.org/officeDocument/2006/bibliography" xmlns="http://schemas.openxmlformats.org/officeDocument/2006/bibliography" SelectedStyle="\APASixthEditionOfficeOnline.xsl" StyleName="APA" Version="6"/>
+</file>
+
 <file path=customXml/item3.xml><?xml version="1.0" encoding="utf-8"?>
+<?mso-contentType ?>
+<FormTemplates xmlns="http://schemas.microsoft.com/sharepoint/v3/contenttype/forms">
+  <Display>DocumentLibraryForm</Display>
+  <Edit>DocumentLibraryForm</Edit>
+  <New>DocumentLibraryForm</New>
+</FormTemplates>
+</file>
+
+<file path=customXml/item4.xml><?xml version="1.0" encoding="utf-8"?>
 <ct:contentTypeSchema xmlns:ct="http://schemas.microsoft.com/office/2006/metadata/contentType" xmlns:ma="http://schemas.microsoft.com/office/2006/metadata/properties/metaAttributes" ct:_="" ma:_="" ma:contentTypeName="Document" ma:contentTypeID="0x0101006AB4AEB0F8404D4D9722CE80798CC795" ma:contentTypeVersion="15" ma:contentTypeDescription="Create a new document." ma:contentTypeScope="" ma:versionID="e11a8a53b54f146900b9c3a50a9d2c33">
   <xsd:schema xmlns:xsd="http://www.w3.org/2001/XMLSchema" xmlns:xs="http://www.w3.org/2001/XMLSchema" xmlns:p="http://schemas.microsoft.com/office/2006/metadata/properties" xmlns:ns2="f6ea7ea9-81b2-4d9c-a1ab-ed9a056c4fa0" xmlns:ns3="95283c23-d003-43db-900f-7fa5934590f8" targetNamespace="http://schemas.microsoft.com/office/2006/metadata/properties" ma:root="true" ma:fieldsID="34edffe4faf2b1bc65e4398f60194591" ns2:_="" ns3:_="">
     <xsd:import namespace="f6ea7ea9-81b2-4d9c-a1ab-ed9a056c4fa0"/>
@@ -32403,24 +32426,7 @@
 </ct:contentTypeSchema>
 </file>
 
-<file path=customXml/item4.xml><?xml version="1.0" encoding="utf-8"?>
-<?mso-contentType ?>
-<FormTemplates xmlns="http://schemas.microsoft.com/sharepoint/v3/contenttype/forms">
-  <Display>DocumentLibraryForm</Display>
-  <Edit>DocumentLibraryForm</Edit>
-  <New>DocumentLibraryForm</New>
-</FormTemplates>
-</file>
-
 <file path=customXml/itemProps1.xml><?xml version="1.0" encoding="utf-8"?>
-<ds:datastoreItem xmlns:ds="http://schemas.openxmlformats.org/officeDocument/2006/customXml" ds:itemID="{B6381998-5783-41AC-A862-3F976B741E2B}">
-  <ds:schemaRefs>
-    <ds:schemaRef ds:uri="http://schemas.openxmlformats.org/officeDocument/2006/bibliography"/>
-  </ds:schemaRefs>
-</ds:datastoreItem>
-</file>
-
-<file path=customXml/itemProps2.xml><?xml version="1.0" encoding="utf-8"?>
 <ds:datastoreItem xmlns:ds="http://schemas.openxmlformats.org/officeDocument/2006/customXml" ds:itemID="{B9C45EB4-DCB3-443C-8BA2-490F7CA03750}">
   <ds:schemaRefs>
     <ds:schemaRef ds:uri="http://schemas.microsoft.com/office/2006/metadata/properties"/>
@@ -32430,7 +32436,23 @@
 </ds:datastoreItem>
 </file>
 
+<file path=customXml/itemProps2.xml><?xml version="1.0" encoding="utf-8"?>
+<ds:datastoreItem xmlns:ds="http://schemas.openxmlformats.org/officeDocument/2006/customXml" ds:itemID="{B6381998-5783-41AC-A862-3F976B741E2B}">
+  <ds:schemaRefs>
+    <ds:schemaRef ds:uri="http://schemas.openxmlformats.org/officeDocument/2006/bibliography"/>
+  </ds:schemaRefs>
+</ds:datastoreItem>
+</file>
+
 <file path=customXml/itemProps3.xml><?xml version="1.0" encoding="utf-8"?>
+<ds:datastoreItem xmlns:ds="http://schemas.openxmlformats.org/officeDocument/2006/customXml" ds:itemID="{00C5860C-7760-48D1-B320-EE8C74D7C2D0}">
+  <ds:schemaRefs>
+    <ds:schemaRef ds:uri="http://schemas.microsoft.com/sharepoint/v3/contenttype/forms"/>
+  </ds:schemaRefs>
+</ds:datastoreItem>
+</file>
+
+<file path=customXml/itemProps4.xml><?xml version="1.0" encoding="utf-8"?>
 <ds:datastoreItem xmlns:ds="http://schemas.openxmlformats.org/officeDocument/2006/customXml" ds:itemID="{B5E55C6E-2537-4695-8F11-85AD1F171EEE}">
   <ds:schemaRefs>
     <ds:schemaRef ds:uri="http://schemas.microsoft.com/office/2006/metadata/contentType"/>
@@ -32447,12 +32469,4 @@
     <ds:schemaRef ds:uri="http://schemas.microsoft.com/internal/obd"/>
   </ds:schemaRefs>
 </ds:datastoreItem>
-</file>
-
-<file path=customXml/itemProps4.xml><?xml version="1.0" encoding="utf-8"?>
-<ds:datastoreItem xmlns:ds="http://schemas.openxmlformats.org/officeDocument/2006/customXml" ds:itemID="{00C5860C-7760-48D1-B320-EE8C74D7C2D0}">
-  <ds:schemaRefs>
-    <ds:schemaRef ds:uri="http://schemas.microsoft.com/sharepoint/v3/contenttype/forms"/>
-  </ds:schemaRefs>
-</ds:datastoreItem>
 </file>
</xml_diff>